<commit_message>
Remove project repository metadata from PRD Word document
</commit_message>
<xml_diff>
--- a/Chronologie_Manual_Book_PRD.docx
+++ b/Chronologie_Manual_Book_PRD.docx
@@ -91,20 +91,6 @@
           <w:color w:val="2B2622"/>
         </w:rPr>
         <w:t>July 5, 2026</w:t>
-        <w:br/>
-      </w:r>
-      <w:r>
-        <w:rPr>
-          <w:b/>
-          <w:color w:val="442A07"/>
-        </w:rPr>
-        <w:t xml:space="preserve">Project Repository: </w:t>
-      </w:r>
-      <w:r>
-        <w:rPr>
-          <w:color w:val="2B2622"/>
-        </w:rPr>
-        <w:t>https://github.com/halonemuinai-sys/Chronologie-Manual-Book-V2.git</w:t>
         <w:br/>
       </w:r>
     </w:p>

</xml_diff>

<commit_message>
Update PRD Word document to include local hosting cost comparison
</commit_message>
<xml_diff>
--- a/Chronologie_Manual_Book_PRD.docx
+++ b/Chronologie_Manual_Book_PRD.docx
@@ -465,7 +465,7 @@
         <w:spacing w:line="276" w:lineRule="auto" w:after="200"/>
       </w:pPr>
       <w:r>
-        <w:t>Berikut adalah perbandingan nilai ekonomis antara menyerahkan pengerjaan ke pihak ketiga (Outsource) dengan melakukan pengembangan mandiri memanfaatkan AI (Self Development + Claude Pro &amp; Vercel):</w:t>
+        <w:t>Berikut adalah perbandingan nilai ekonomis antara menyerahkan pengerjaan ke pihak ketiga (Outsource), pengembangan mandiri menggunakan server VPS lokal (Hosting Lokal), serta pengembangan mandiri menggunakan serverless CDN (Vercel):</w:t>
       </w:r>
     </w:p>
     <w:tbl>
@@ -475,14 +475,15 @@
         <w:tblLook w:firstColumn="1" w:firstRow="1" w:lastColumn="0" w:lastRow="0" w:noHBand="0" w:noVBand="1" w:val="04A0"/>
       </w:tblPr>
       <w:tblGrid>
-        <w:gridCol w:w="3120"/>
-        <w:gridCol w:w="3120"/>
-        <w:gridCol w:w="3120"/>
+        <w:gridCol w:w="2340"/>
+        <w:gridCol w:w="2340"/>
+        <w:gridCol w:w="2340"/>
+        <w:gridCol w:w="2340"/>
       </w:tblGrid>
       <w:tr>
         <w:tc>
           <w:tcPr>
-            <w:tcW w:type="dxa" w:w="3120"/>
+            <w:tcW w:type="dxa" w:w="2340"/>
             <w:shd w:fill="442A07"/>
           </w:tcPr>
           <w:p>
@@ -497,7 +498,7 @@
         </w:tc>
         <w:tc>
           <w:tcPr>
-            <w:tcW w:type="dxa" w:w="3120"/>
+            <w:tcW w:type="dxa" w:w="2340"/>
             <w:shd w:fill="442A07"/>
           </w:tcPr>
           <w:p>
@@ -506,13 +507,13 @@
                 <w:b/>
                 <w:color w:val="FFFFFF"/>
               </w:rPr>
-              <w:t>Jasa Outsource (Freelance/Agency)</w:t>
+              <w:t>Jasa Outsource (Agency)</w:t>
             </w:r>
           </w:p>
         </w:tc>
         <w:tc>
           <w:tcPr>
-            <w:tcW w:type="dxa" w:w="3120"/>
+            <w:tcW w:type="dxa" w:w="2340"/>
             <w:shd w:fill="442A07"/>
           </w:tcPr>
           <w:p>
@@ -521,7 +522,22 @@
                 <w:b/>
                 <w:color w:val="FFFFFF"/>
               </w:rPr>
-              <w:t>Self Dev + AI (Claude + Vercel)</w:t>
+              <w:t>Self Dev + Hosting Lokal (VPS)</w:t>
+            </w:r>
+          </w:p>
+        </w:tc>
+        <w:tc>
+          <w:tcPr>
+            <w:tcW w:type="dxa" w:w="2340"/>
+            <w:shd w:fill="442A07"/>
+          </w:tcPr>
+          <w:p>
+            <w:r>
+              <w:rPr>
+                <w:b/>
+                <w:color w:val="FFFFFF"/>
+              </w:rPr>
+              <w:t>Self Dev + AI + Vercel</w:t>
             </w:r>
           </w:p>
         </w:tc>
@@ -529,31 +545,44 @@
       <w:tr>
         <w:tc>
           <w:tcPr>
-            <w:tcW w:type="dxa" w:w="3120"/>
+            <w:tcW w:type="dxa" w:w="2340"/>
             <w:shd w:fill="FBF9F1"/>
           </w:tcPr>
           <w:p>
             <w:r>
-              <w:t>Biaya Pembuatan Awal (Dev)</w:t>
+              <w:t>Biaya Pembuatan Awal</w:t>
             </w:r>
           </w:p>
         </w:tc>
         <w:tc>
           <w:tcPr>
-            <w:tcW w:type="dxa" w:w="3120"/>
+            <w:tcW w:type="dxa" w:w="2340"/>
             <w:shd w:fill="FBF9F1"/>
           </w:tcPr>
           <w:p>
             <w:r>
               <w:t>Rp 5.000.000 - Rp 15.000.000</w:t>
               <w:br/>
-              <w:t>(Biaya jasa pembuatan aplikasi SPA)</w:t>
+              <w:t>(Biaya pembuatan aplikasi)</w:t>
             </w:r>
           </w:p>
         </w:tc>
         <w:tc>
           <w:tcPr>
-            <w:tcW w:type="dxa" w:w="3120"/>
+            <w:tcW w:type="dxa" w:w="2340"/>
+            <w:shd w:fill="FBF9F1"/>
+          </w:tcPr>
+          <w:p>
+            <w:r>
+              <w:t>Rp 0</w:t>
+              <w:br/>
+              <w:t>(Dikerjakan mandiri dibantu AI)</w:t>
+            </w:r>
+          </w:p>
+        </w:tc>
+        <w:tc>
+          <w:tcPr>
+            <w:tcW w:type="dxa" w:w="2340"/>
             <w:shd w:fill="FBF9F1"/>
           </w:tcPr>
           <w:p>
@@ -568,18 +597,18 @@
       <w:tr>
         <w:tc>
           <w:tcPr>
-            <w:tcW w:type="dxa" w:w="3120"/>
+            <w:tcW w:type="dxa" w:w="2340"/>
             <w:shd w:fill="FFFFFF"/>
           </w:tcPr>
           <w:p>
             <w:r>
-              <w:t>Alat Bantu AI (Claude/Gemini)</w:t>
+              <w:t>Alat Bantu AI (Claude)</w:t>
             </w:r>
           </w:p>
         </w:tc>
         <w:tc>
           <w:tcPr>
-            <w:tcW w:type="dxa" w:w="3120"/>
+            <w:tcW w:type="dxa" w:w="2340"/>
             <w:shd w:fill="FFFFFF"/>
           </w:tcPr>
           <w:p>
@@ -590,14 +619,27 @@
         </w:tc>
         <w:tc>
           <w:tcPr>
-            <w:tcW w:type="dxa" w:w="3120"/>
+            <w:tcW w:type="dxa" w:w="2340"/>
             <w:shd w:fill="FFFFFF"/>
           </w:tcPr>
           <w:p>
             <w:r>
               <w:t>Rp 325.000 / bulan ($20)</w:t>
               <w:br/>
-              <w:t>Total Setahun: Rp 3.900.000</w:t>
+              <w:t>Total: Rp 3.900.000</w:t>
+            </w:r>
+          </w:p>
+        </w:tc>
+        <w:tc>
+          <w:tcPr>
+            <w:tcW w:type="dxa" w:w="2340"/>
+            <w:shd w:fill="FFFFFF"/>
+          </w:tcPr>
+          <w:p>
+            <w:r>
+              <w:t>Rp 325.000 / bulan ($20)</w:t>
+              <w:br/>
+              <w:t>Total: Rp 3.900.000</w:t>
             </w:r>
           </w:p>
         </w:tc>
@@ -605,7 +647,7 @@
       <w:tr>
         <w:tc>
           <w:tcPr>
-            <w:tcW w:type="dxa" w:w="3120"/>
+            <w:tcW w:type="dxa" w:w="2340"/>
             <w:shd w:fill="FBF9F1"/>
           </w:tcPr>
           <w:p>
@@ -616,27 +658,40 @@
         </w:tc>
         <w:tc>
           <w:tcPr>
-            <w:tcW w:type="dxa" w:w="3120"/>
+            <w:tcW w:type="dxa" w:w="2340"/>
             <w:shd w:fill="FBF9F1"/>
           </w:tcPr>
           <w:p>
             <w:r>
               <w:t>Rp 200.000 - Rp 500.000 / bulan</w:t>
               <w:br/>
-              <w:t>Total Setahun: Rp 2.400.000 - Rp 6.000.000</w:t>
+              <w:t>Total: Rp 2.400.000 - Rp 6.000.000</w:t>
             </w:r>
           </w:p>
         </w:tc>
         <w:tc>
           <w:tcPr>
-            <w:tcW w:type="dxa" w:w="3120"/>
+            <w:tcW w:type="dxa" w:w="2340"/>
+            <w:shd w:fill="FBF9F1"/>
+          </w:tcPr>
+          <w:p>
+            <w:r>
+              <w:t>Rp 150.000 - Rp 350.000 / bulan</w:t>
+              <w:br/>
+              <w:t>Total: Rp 1.800.000 - Rp 4.200.000</w:t>
+            </w:r>
+          </w:p>
+        </w:tc>
+        <w:tc>
+          <w:tcPr>
+            <w:tcW w:type="dxa" w:w="2340"/>
             <w:shd w:fill="FBF9F1"/>
           </w:tcPr>
           <w:p>
             <w:r>
               <w:t>Rp 0 (Vercel Hobby Tier - Free)</w:t>
               <w:br/>
-              <w:t>Total Setahun: Rp 0</w:t>
+              <w:t>Total: Rp 0</w:t>
             </w:r>
           </w:p>
         </w:tc>
@@ -644,7 +699,7 @@
       <w:tr>
         <w:tc>
           <w:tcPr>
-            <w:tcW w:type="dxa" w:w="3120"/>
+            <w:tcW w:type="dxa" w:w="2340"/>
             <w:shd w:fill="FFFFFF"/>
           </w:tcPr>
           <w:p>
@@ -655,7 +710,7 @@
         </w:tc>
         <w:tc>
           <w:tcPr>
-            <w:tcW w:type="dxa" w:w="3120"/>
+            <w:tcW w:type="dxa" w:w="2340"/>
             <w:shd w:fill="FFFFFF"/>
           </w:tcPr>
           <w:p>
@@ -666,7 +721,18 @@
         </w:tc>
         <w:tc>
           <w:tcPr>
-            <w:tcW w:type="dxa" w:w="3120"/>
+            <w:tcW w:type="dxa" w:w="2340"/>
+            <w:shd w:fill="FFFFFF"/>
+          </w:tcPr>
+          <w:p>
+            <w:r>
+              <w:t>Rp 150.000 - Rp 250.000 / tahun</w:t>
+            </w:r>
+          </w:p>
+        </w:tc>
+        <w:tc>
+          <w:tcPr>
+            <w:tcW w:type="dxa" w:w="2340"/>
             <w:shd w:fill="FFFFFF"/>
           </w:tcPr>
           <w:p>
@@ -679,31 +745,44 @@
       <w:tr>
         <w:tc>
           <w:tcPr>
-            <w:tcW w:type="dxa" w:w="3120"/>
+            <w:tcW w:type="dxa" w:w="2340"/>
             <w:shd w:fill="FBF9F1"/>
           </w:tcPr>
           <w:p>
             <w:r>
-              <w:t>Pemeliharaan &amp; Update Konten</w:t>
+              <w:t>Pemeliharaan &amp; Sysadmin</w:t>
             </w:r>
           </w:p>
         </w:tc>
         <w:tc>
           <w:tcPr>
-            <w:tcW w:type="dxa" w:w="3120"/>
+            <w:tcW w:type="dxa" w:w="2340"/>
             <w:shd w:fill="FBF9F1"/>
           </w:tcPr>
           <w:p>
             <w:r>
               <w:t>Rp 500.000 - Rp 1.500.000 / update</w:t>
               <w:br/>
-              <w:t>(Setiap ada revisi / tambah file PDF baru)</w:t>
+              <w:t>(Setiap tambah file PDF baru)</w:t>
             </w:r>
           </w:p>
         </w:tc>
         <w:tc>
           <w:tcPr>
-            <w:tcW w:type="dxa" w:w="3120"/>
+            <w:tcW w:type="dxa" w:w="2340"/>
+            <w:shd w:fill="FBF9F1"/>
+          </w:tcPr>
+          <w:p>
+            <w:r>
+              <w:t>Rp 500.000 - Rp 1.000.000 / bulan</w:t>
+              <w:br/>
+              <w:t>(Biaya monitoring &amp; setup VPS lokal)</w:t>
+            </w:r>
+          </w:p>
+        </w:tc>
+        <w:tc>
+          <w:tcPr>
+            <w:tcW w:type="dxa" w:w="2340"/>
             <w:shd w:fill="FBF9F1"/>
           </w:tcPr>
           <w:p>
@@ -740,7 +819,17 @@
         <w:br/>
       </w:r>
       <w:r>
-        <w:t xml:space="preserve">• Self Dev + AI: </w:t>
+        <w:t xml:space="preserve">• Self Dev + Hosting Lokal (VPS): </w:t>
+      </w:r>
+      <w:r>
+        <w:rPr>
+          <w:b/>
+        </w:rPr>
+        <w:t>Rp 11.850.000 - Rp 20.350.000</w:t>
+        <w:br/>
+      </w:r>
+      <w:r>
+        <w:t xml:space="preserve">• Self Dev + AI + Serverless (Vercel): </w:t>
       </w:r>
       <w:r>
         <w:rPr>
@@ -758,16 +847,16 @@
         <w:t xml:space="preserve">Kesimpulan &amp; Efisiensi: </w:t>
       </w:r>
       <w:r>
-        <w:t xml:space="preserve">Self-Development dengan bantuan Claude Pro menghemat biaya hingga </w:t>
+        <w:t xml:space="preserve">Self-Development menggunakan Vercel Serverless terbukti jauh lebih hemat dibandingkan Hosting Lokal (mengurangi biaya hingga </w:t>
       </w:r>
       <w:r>
         <w:rPr>
           <w:b/>
         </w:rPr>
-        <w:t xml:space="preserve">50% - 80% </w:t>
+        <w:t>60% - 80%</w:t>
       </w:r>
       <w:r>
-        <w:t>pada tahun pertama. Ditambah lagi, proses penambahan file PDF manual di masa depan dapat dilakukan secara mandiri hanya dalam beberapa menit tanpa ketergantungan atau biaya revisi dari pihak ketiga.</w:t>
+        <w:t>). Pada Hosting Lokal, biaya membengkak karena adanya kewajiban pengelolaan server (sysadmin) untuk menjamin agar server tidak down/mati saat diakses pelanggan, sedangkan Vercel menangani infrastruktur tersebut secara otomatis dan gratis.</w:t>
       </w:r>
     </w:p>
     <w:sectPr>

</xml_diff>

<commit_message>
Add Approval & Sign-Off section to PRD documents (Word and Markdown)
</commit_message>
<xml_diff>
--- a/Chronologie_Manual_Book_PRD.docx
+++ b/Chronologie_Manual_Book_PRD.docx
@@ -859,6 +859,188 @@
         <w:t>). Pada Hosting Lokal, biaya membengkak karena adanya kewajiban pengelolaan server (sysadmin) untuk menjamin agar server tidak down/mati saat diakses pelanggan, sedangkan Vercel menangani infrastruktur tersebut secara otomatis dan gratis.</w:t>
       </w:r>
     </w:p>
+    <w:p>
+      <w:pPr>
+        <w:pStyle w:val="Heading1"/>
+        <w:spacing w:before="320" w:after="120"/>
+      </w:pPr>
+      <w:r>
+        <w:rPr>
+          <w:rFonts w:ascii="Outfit" w:hAnsi="Outfit"/>
+          <w:b/>
+          <w:color w:val="442A07"/>
+          <w:sz w:val="30"/>
+        </w:rPr>
+        <w:t>6. Approval &amp; Sign-Off</w:t>
+      </w:r>
+    </w:p>
+    <w:p>
+      <w:pPr>
+        <w:spacing w:line="276" w:lineRule="auto" w:after="200"/>
+      </w:pPr>
+      <w:r>
+        <w:t>Dokumen PRD ini telah ditinjau dan disetujui untuk masuk ke tahap implementasi penuh:</w:t>
+      </w:r>
+    </w:p>
+    <w:tbl>
+      <w:tblPr>
+        <w:tblW w:type="auto" w:w="0"/>
+        <w:jc w:val="center"/>
+        <w:tblLook w:firstColumn="1" w:firstRow="1" w:lastColumn="0" w:lastRow="0" w:noHBand="0" w:noVBand="1" w:val="04A0"/>
+      </w:tblPr>
+      <w:tblGrid>
+        <w:gridCol w:w="2340"/>
+        <w:gridCol w:w="2340"/>
+        <w:gridCol w:w="2340"/>
+        <w:gridCol w:w="2340"/>
+      </w:tblGrid>
+      <w:tr>
+        <w:tc>
+          <w:tcPr>
+            <w:tcW w:type="dxa" w:w="2340"/>
+            <w:shd w:fill="442A07"/>
+          </w:tcPr>
+          <w:p>
+            <w:r>
+              <w:rPr>
+                <w:b/>
+                <w:color w:val="FFFFFF"/>
+              </w:rPr>
+              <w:t>Peran / Jabatan</w:t>
+            </w:r>
+          </w:p>
+        </w:tc>
+        <w:tc>
+          <w:tcPr>
+            <w:tcW w:type="dxa" w:w="2340"/>
+            <w:shd w:fill="442A07"/>
+          </w:tcPr>
+          <w:p>
+            <w:r>
+              <w:rPr>
+                <w:b/>
+                <w:color w:val="FFFFFF"/>
+              </w:rPr>
+              <w:t>Nama</w:t>
+            </w:r>
+          </w:p>
+        </w:tc>
+        <w:tc>
+          <w:tcPr>
+            <w:tcW w:type="dxa" w:w="2340"/>
+            <w:shd w:fill="442A07"/>
+          </w:tcPr>
+          <w:p>
+            <w:r>
+              <w:rPr>
+                <w:b/>
+                <w:color w:val="FFFFFF"/>
+              </w:rPr>
+              <w:t>Tanda Tangan / Status</w:t>
+            </w:r>
+          </w:p>
+        </w:tc>
+        <w:tc>
+          <w:tcPr>
+            <w:tcW w:type="dxa" w:w="2340"/>
+            <w:shd w:fill="442A07"/>
+          </w:tcPr>
+          <w:p>
+            <w:r>
+              <w:rPr>
+                <w:b/>
+                <w:color w:val="FFFFFF"/>
+              </w:rPr>
+              <w:t>Tanggal</w:t>
+            </w:r>
+          </w:p>
+        </w:tc>
+      </w:tr>
+      <w:tr>
+        <w:tc>
+          <w:tcPr>
+            <w:tcW w:type="dxa" w:w="2340"/>
+            <w:shd w:fill="FBF9F1"/>
+          </w:tcPr>
+          <w:p>
+            <w:r>
+              <w:t>Business Sponsor / Owner</w:t>
+            </w:r>
+          </w:p>
+        </w:tc>
+        <w:tc>
+          <w:tcPr>
+            <w:tcW w:type="dxa" w:w="2340"/>
+            <w:shd w:fill="FBF9F1"/>
+          </w:tcPr>
+          <w:p>
+            <w:r>
+              <w:t>[Nama Owner]</w:t>
+            </w:r>
+          </w:p>
+        </w:tc>
+        <w:tc>
+          <w:tcPr>
+            <w:tcW w:type="dxa" w:w="2340"/>
+            <w:shd w:fill="FBF9F1"/>
+          </w:tcPr>
+          <w:p>
+            <w:r/>
+          </w:p>
+        </w:tc>
+        <w:tc>
+          <w:tcPr>
+            <w:tcW w:type="dxa" w:w="2340"/>
+            <w:shd w:fill="FBF9F1"/>
+          </w:tcPr>
+          <w:p>
+            <w:r/>
+          </w:p>
+        </w:tc>
+      </w:tr>
+      <w:tr>
+        <w:tc>
+          <w:tcPr>
+            <w:tcW w:type="dxa" w:w="2340"/>
+            <w:shd w:fill="FFFFFF"/>
+          </w:tcPr>
+          <w:p>
+            <w:r>
+              <w:t>IT Development Partner</w:t>
+            </w:r>
+          </w:p>
+        </w:tc>
+        <w:tc>
+          <w:tcPr>
+            <w:tcW w:type="dxa" w:w="2340"/>
+            <w:shd w:fill="FFFFFF"/>
+          </w:tcPr>
+          <w:p>
+            <w:r>
+              <w:t>[Nama Developer / AI]</w:t>
+            </w:r>
+          </w:p>
+        </w:tc>
+        <w:tc>
+          <w:tcPr>
+            <w:tcW w:type="dxa" w:w="2340"/>
+            <w:shd w:fill="FFFFFF"/>
+          </w:tcPr>
+          <w:p>
+            <w:r/>
+          </w:p>
+        </w:tc>
+        <w:tc>
+          <w:tcPr>
+            <w:tcW w:type="dxa" w:w="2340"/>
+            <w:shd w:fill="FFFFFF"/>
+          </w:tcPr>
+          <w:p>
+            <w:r/>
+          </w:p>
+        </w:tc>
+      </w:tr>
+    </w:tbl>
     <w:sectPr>
       <w:pgSz w:w="12240" w:h="15840"/>
       <w:pgMar w:top="1440" w:right="1440" w:bottom="1440" w:left="1440" w:header="720" w:footer="720" w:gutter="0"/>

</xml_diff>

<commit_message>
Update PRD approvals with Erick Winata and Aris Setiyono
</commit_message>
<xml_diff>
--- a/Chronologie_Manual_Book_PRD.docx
+++ b/Chronologie_Manual_Book_PRD.docx
@@ -964,7 +964,7 @@
           </w:tcPr>
           <w:p>
             <w:r>
-              <w:t>Business Sponsor / Owner</w:t>
+              <w:t>Manager Chronologie</w:t>
             </w:r>
           </w:p>
         </w:tc>
@@ -975,7 +975,7 @@
           </w:tcPr>
           <w:p>
             <w:r>
-              <w:t>[Nama Owner]</w:t>
+              <w:t>Erick Winata</w:t>
             </w:r>
           </w:p>
         </w:tc>
@@ -1006,7 +1006,7 @@
           </w:tcPr>
           <w:p>
             <w:r>
-              <w:t>IT Development Partner</w:t>
+              <w:t>IT Business Partner</w:t>
             </w:r>
           </w:p>
         </w:tc>
@@ -1017,7 +1017,7 @@
           </w:tcPr>
           <w:p>
             <w:r>
-              <w:t>[Nama Developer / AI]</w:t>
+              <w:t>Aris Setiyono</w:t>
             </w:r>
           </w:p>
         </w:tc>

</xml_diff>

<commit_message>
Update PRD Word document with side-by-side signature boxes for Aris Setiyono and Erick Winata
</commit_message>
<xml_diff>
--- a/Chronologie_Manual_Book_PRD.docx
+++ b/Chronologie_Manual_Book_PRD.docx
@@ -876,171 +876,188 @@
     </w:p>
     <w:p>
       <w:pPr>
-        <w:spacing w:line="276" w:lineRule="auto" w:after="200"/>
+        <w:spacing w:before="160" w:after="40"/>
       </w:pPr>
       <w:r>
-        <w:t>Dokumen PRD ini telah ditinjau dan disetujui untuk masuk ke tahap implementasi penuh:</w:t>
+        <w:rPr>
+          <w:rFonts w:ascii="Outfit" w:hAnsi="Outfit"/>
+          <w:b/>
+          <w:color w:val="8F6F3F"/>
+          <w:sz w:val="17"/>
+        </w:rPr>
+        <w:t>LEMBAR PERSETUJUAN PROYEK</w:t>
+      </w:r>
+    </w:p>
+    <w:p>
+      <w:pPr>
+        <w:spacing w:after="320"/>
+      </w:pPr>
+      <w:r>
+        <w:rPr>
+          <w:rFonts w:ascii="Outfit" w:hAnsi="Outfit"/>
+          <w:b/>
+          <w:color w:val="442A07"/>
+          <w:sz w:val="32"/>
+        </w:rPr>
+        <w:t>Approval Project Chronologie Manual Book</w:t>
       </w:r>
     </w:p>
     <w:tbl>
       <w:tblPr>
         <w:tblW w:type="auto" w:w="0"/>
         <w:jc w:val="center"/>
+        <w:tblLayout w:type="fixed"/>
         <w:tblLook w:firstColumn="1" w:firstRow="1" w:lastColumn="0" w:lastRow="0" w:noHBand="0" w:noVBand="1" w:val="04A0"/>
       </w:tblPr>
       <w:tblGrid>
-        <w:gridCol w:w="2340"/>
-        <w:gridCol w:w="2340"/>
-        <w:gridCol w:w="2340"/>
-        <w:gridCol w:w="2340"/>
+        <w:gridCol w:w="4464"/>
+        <w:gridCol w:w="4464"/>
       </w:tblGrid>
       <w:tr>
         <w:tc>
           <w:tcPr>
-            <w:tcW w:type="dxa" w:w="2340"/>
-            <w:shd w:fill="442A07"/>
+            <w:tcW w:type="dxa" w:w="4680"/>
+            <w:tcMar>
+              <w:top w:w="200" w:type="dxa"/>
+              <w:bottom w:w="200" w:type="dxa"/>
+              <w:left w:w="240" w:type="dxa"/>
+              <w:right w:w="240" w:type="dxa"/>
+            </w:tcMar>
+            <w:tcBorders>
+              <w:top w:val="single" w:sz="4" w:space="0" w:color="DCDCDC"/>
+              <w:left w:val="single" w:sz="4" w:space="0" w:color="DCDCDC"/>
+              <w:bottom w:val="single" w:sz="4" w:space="0" w:color="DCDCDC"/>
+              <w:right w:val="single" w:sz="4" w:space="0" w:color="DCDCDC"/>
+            </w:tcBorders>
           </w:tcPr>
           <w:p>
+            <w:pPr>
+              <w:spacing w:after="40"/>
+            </w:pPr>
             <w:r>
               <w:rPr>
+                <w:rFonts w:ascii="Outfit" w:hAnsi="Outfit"/>
                 <w:b/>
-                <w:color w:val="FFFFFF"/>
+                <w:color w:val="8F6F3F"/>
+                <w:sz w:val="16"/>
               </w:rPr>
-              <w:t>Peran / Jabatan</w:t>
+              <w:t>DIBUAT OLEH</w:t>
+              <w:br/>
+              <w:br/>
+              <w:br/>
+              <w:br/>
+              <w:br/>
+              <w:t>__________________________________</w:t>
+              <w:br/>
             </w:r>
-          </w:p>
-        </w:tc>
-        <w:tc>
-          <w:tcPr>
-            <w:tcW w:type="dxa" w:w="2340"/>
-            <w:shd w:fill="442A07"/>
-          </w:tcPr>
-          <w:p>
             <w:r>
               <w:rPr>
+                <w:rFonts w:ascii="Outfit" w:hAnsi="Outfit"/>
                 <w:b/>
-                <w:color w:val="FFFFFF"/>
+                <w:color w:val="442A07"/>
+                <w:sz w:val="21"/>
               </w:rPr>
-              <w:t>Nama</w:t>
+              <w:t>Aris Setiyono</w:t>
+              <w:br/>
             </w:r>
-          </w:p>
-        </w:tc>
-        <w:tc>
-          <w:tcPr>
-            <w:tcW w:type="dxa" w:w="2340"/>
-            <w:shd w:fill="442A07"/>
-          </w:tcPr>
-          <w:p>
             <w:r>
               <w:rPr>
-                <w:b/>
-                <w:color w:val="FFFFFF"/>
+                <w:rFonts w:ascii="Outfit" w:hAnsi="Outfit"/>
+                <w:color w:val="2B2622"/>
+                <w:sz w:val="18"/>
               </w:rPr>
-              <w:t>Tanda Tangan / Status</w:t>
-            </w:r>
-          </w:p>
-        </w:tc>
-        <w:tc>
-          <w:tcPr>
-            <w:tcW w:type="dxa" w:w="2340"/>
-            <w:shd w:fill="442A07"/>
-          </w:tcPr>
-          <w:p>
-            <w:r>
-              <w:rPr>
-                <w:b/>
-                <w:color w:val="FFFFFF"/>
-              </w:rPr>
-              <w:t>Tanggal</w:t>
-            </w:r>
-          </w:p>
-        </w:tc>
-      </w:tr>
-      <w:tr>
-        <w:tc>
-          <w:tcPr>
-            <w:tcW w:type="dxa" w:w="2340"/>
-            <w:shd w:fill="FBF9F1"/>
-          </w:tcPr>
-          <w:p>
-            <w:r>
-              <w:t>Manager Chronologie</w:t>
-            </w:r>
-          </w:p>
-        </w:tc>
-        <w:tc>
-          <w:tcPr>
-            <w:tcW w:type="dxa" w:w="2340"/>
-            <w:shd w:fill="FBF9F1"/>
-          </w:tcPr>
-          <w:p>
-            <w:r>
-              <w:t>Erick Winata</w:t>
-            </w:r>
-          </w:p>
-        </w:tc>
-        <w:tc>
-          <w:tcPr>
-            <w:tcW w:type="dxa" w:w="2340"/>
-            <w:shd w:fill="FBF9F1"/>
-          </w:tcPr>
-          <w:p>
-            <w:r/>
-          </w:p>
-        </w:tc>
-        <w:tc>
-          <w:tcPr>
-            <w:tcW w:type="dxa" w:w="2340"/>
-            <w:shd w:fill="FBF9F1"/>
-          </w:tcPr>
-          <w:p>
-            <w:r/>
-          </w:p>
-        </w:tc>
-      </w:tr>
-      <w:tr>
-        <w:tc>
-          <w:tcPr>
-            <w:tcW w:type="dxa" w:w="2340"/>
-            <w:shd w:fill="FFFFFF"/>
-          </w:tcPr>
-          <w:p>
-            <w:r>
               <w:t>IT Business Partner</w:t>
             </w:r>
           </w:p>
         </w:tc>
         <w:tc>
           <w:tcPr>
-            <w:tcW w:type="dxa" w:w="2340"/>
-            <w:shd w:fill="FFFFFF"/>
+            <w:tcW w:type="dxa" w:w="4680"/>
+            <w:tcMar>
+              <w:top w:w="200" w:type="dxa"/>
+              <w:bottom w:w="200" w:type="dxa"/>
+              <w:left w:w="240" w:type="dxa"/>
+              <w:right w:w="240" w:type="dxa"/>
+            </w:tcMar>
+            <w:tcBorders>
+              <w:top w:val="single" w:sz="4" w:space="0" w:color="DCDCDC"/>
+              <w:left w:val="single" w:sz="4" w:space="0" w:color="DCDCDC"/>
+              <w:bottom w:val="single" w:sz="4" w:space="0" w:color="DCDCDC"/>
+              <w:right w:val="single" w:sz="4" w:space="0" w:color="DCDCDC"/>
+            </w:tcBorders>
           </w:tcPr>
           <w:p>
+            <w:pPr>
+              <w:spacing w:after="40"/>
+            </w:pPr>
             <w:r>
-              <w:t>Aris Setiyono</w:t>
+              <w:rPr>
+                <w:rFonts w:ascii="Outfit" w:hAnsi="Outfit"/>
+                <w:b/>
+                <w:color w:val="8F6F3F"/>
+                <w:sz w:val="16"/>
+              </w:rPr>
+              <w:t>DISETUJUI OLEH</w:t>
+              <w:br/>
+              <w:br/>
+              <w:br/>
+              <w:br/>
+              <w:br/>
+              <w:t>__________________________________</w:t>
+              <w:br/>
             </w:r>
-          </w:p>
-        </w:tc>
-        <w:tc>
-          <w:tcPr>
-            <w:tcW w:type="dxa" w:w="2340"/>
-            <w:shd w:fill="FFFFFF"/>
-          </w:tcPr>
-          <w:p>
-            <w:r/>
-          </w:p>
-        </w:tc>
-        <w:tc>
-          <w:tcPr>
-            <w:tcW w:type="dxa" w:w="2340"/>
-            <w:shd w:fill="FFFFFF"/>
-          </w:tcPr>
-          <w:p>
-            <w:r/>
+            <w:r>
+              <w:rPr>
+                <w:rFonts w:ascii="Outfit" w:hAnsi="Outfit"/>
+                <w:b/>
+                <w:color w:val="442A07"/>
+                <w:sz w:val="21"/>
+              </w:rPr>
+              <w:t>Erick Winata</w:t>
+              <w:br/>
+            </w:r>
+            <w:r>
+              <w:rPr>
+                <w:rFonts w:ascii="Outfit" w:hAnsi="Outfit"/>
+                <w:color w:val="2B2622"/>
+                <w:sz w:val="18"/>
+              </w:rPr>
+              <w:t>Manager Chronologie</w:t>
+            </w:r>
           </w:p>
         </w:tc>
       </w:tr>
     </w:tbl>
+    <w:p>
+      <w:pPr>
+        <w:spacing w:before="400" w:line="276" w:lineRule="auto"/>
+      </w:pPr>
+      <w:r>
+        <w:rPr>
+          <w:rFonts w:ascii="Outfit" w:hAnsi="Outfit"/>
+          <w:color w:val="2B2622"/>
+          <w:sz w:val="19"/>
+        </w:rPr>
+        <w:t xml:space="preserve">Tanggal: ___________________          </w:t>
+      </w:r>
+      <w:r>
+        <w:rPr>
+          <w:rFonts w:ascii="Outfit" w:hAnsi="Outfit"/>
+          <w:color w:val="2B2622"/>
+          <w:sz w:val="19"/>
+        </w:rPr>
+        <w:t xml:space="preserve">Tempat: </w:t>
+      </w:r>
+      <w:r>
+        <w:rPr>
+          <w:rFonts w:ascii="Outfit" w:hAnsi="Outfit"/>
+          <w:b/>
+          <w:color w:val="442A07"/>
+          <w:sz w:val="19"/>
+        </w:rPr>
+        <w:t>Jakarta</w:t>
+      </w:r>
+    </w:p>
     <w:sectPr>
       <w:pgSz w:w="12240" w:h="15840"/>
       <w:pgMar w:top="1440" w:right="1440" w:bottom="1440" w:left="1440" w:header="720" w:footer="720" w:gutter="0"/>

</xml_diff>

<commit_message>
Update PRD Approval section with explicit statement for Self Development + AI + Serverless (Vercel) scheme
</commit_message>
<xml_diff>
--- a/Chronologie_Manual_Book_PRD.docx
+++ b/Chronologie_Manual_Book_PRD.docx
@@ -876,6 +876,36 @@
     </w:p>
     <w:p>
       <w:pPr>
+        <w:spacing w:line="276" w:lineRule="auto" w:before="120" w:after="280"/>
+      </w:pPr>
+      <w:r>
+        <w:rPr>
+          <w:rFonts w:ascii="Outfit" w:hAnsi="Outfit"/>
+          <w:color w:val="2B2622"/>
+          <w:sz w:val="20"/>
+        </w:rPr>
+        <w:t xml:space="preserve">Dengan menandatangani dokumen ini, kedua belah pihak secara resmi menyetujui persetujuan implementasi proyek dengan skema </w:t>
+      </w:r>
+      <w:r>
+        <w:rPr>
+          <w:rFonts w:ascii="Outfit" w:hAnsi="Outfit"/>
+          <w:b/>
+          <w:color w:val="442A07"/>
+          <w:sz w:val="20"/>
+        </w:rPr>
+        <w:t>Self Development + AI + Serverless (Vercel)</w:t>
+      </w:r>
+      <w:r>
+        <w:rPr>
+          <w:rFonts w:ascii="Outfit" w:hAnsi="Outfit"/>
+          <w:color w:val="2B2622"/>
+          <w:sz w:val="20"/>
+        </w:rPr>
+        <w:t xml:space="preserve"> sesuai dengan analisis kelayakan anggaran pada Bab 5.</w:t>
+      </w:r>
+    </w:p>
+    <w:p>
+      <w:pPr>
         <w:spacing w:before="160" w:after="40"/>
       </w:pPr>
       <w:r>

</xml_diff>

<commit_message>
Update PRD docx and markdown cost and sign-off values to match user modified PDF version
</commit_message>
<xml_diff>
--- a/Chronologie_Manual_Book_PRD.docx
+++ b/Chronologie_Manual_Book_PRD.docx
@@ -14,7 +14,7 @@
           <w:color w:val="442A07"/>
           <w:sz w:val="40"/>
         </w:rPr>
-        <w:t>BUSINESS-IT PARTNERSHIP PRD</w:t>
+        <w:t>Product Requirements Document (PRD)</w:t>
         <w:br/>
       </w:r>
     </w:p>
@@ -30,6 +30,9 @@
           <w:color w:val="8F6F3F"/>
           <w:sz w:val="28"/>
         </w:rPr>
+        <w:t>PT Hourlogy Indah Perkasa</w:t>
+        <w:br/>
+        <w:br/>
         <w:t>Chronologie Watch Manuals Digitalization</w:t>
       </w:r>
     </w:p>
@@ -84,13 +87,41 @@
           <w:b/>
           <w:color w:val="442A07"/>
         </w:rPr>
+        <w:t xml:space="preserve">Brand: </w:t>
+      </w:r>
+      <w:r>
+        <w:rPr>
+          <w:color w:val="2B2622"/>
+        </w:rPr>
+        <w:t>Chronologie</w:t>
+        <w:br/>
+      </w:r>
+      <w:r>
+        <w:rPr>
+          <w:b/>
+          <w:color w:val="442A07"/>
+        </w:rPr>
+        <w:t xml:space="preserve">Mock Up Design: </w:t>
+      </w:r>
+      <w:r>
+        <w:rPr>
+          <w:color w:val="2B2622"/>
+        </w:rPr>
+        <w:t>Vercel Chronologie Manual Book</w:t>
+        <w:br/>
+      </w:r>
+      <w:r>
+        <w:rPr>
+          <w:b/>
+          <w:color w:val="442A07"/>
+        </w:rPr>
         <w:t xml:space="preserve">Date: </w:t>
       </w:r>
       <w:r>
         <w:rPr>
           <w:color w:val="2B2622"/>
         </w:rPr>
-        <w:t>July 5, 2026</w:t>
+        <w:t>July 6, 2026</w:t>
         <w:br/>
       </w:r>
     </w:p>
@@ -576,7 +607,7 @@
             <w:r>
               <w:t>Rp 0</w:t>
               <w:br/>
-              <w:t>(Dikerjakan mandiri dibantu AI)</w:t>
+              <w:t>(Dikerjakan self development with AI)</w:t>
             </w:r>
           </w:p>
         </w:tc>
@@ -589,7 +620,7 @@
             <w:r>
               <w:t>Rp 0</w:t>
               <w:br/>
-              <w:t>(Dikerjakan mandiri dibantu AI)</w:t>
+              <w:t>(Dikerjakan self development with AI)</w:t>
             </w:r>
           </w:p>
         </w:tc>
@@ -624,9 +655,9 @@
           </w:tcPr>
           <w:p>
             <w:r>
-              <w:t>Rp 325.000 / bulan ($20)</w:t>
+              <w:t>Rp 359.000 / bulan ($20)</w:t>
               <w:br/>
-              <w:t>Total: Rp 3.900.000</w:t>
+              <w:t>Total: Rp 359.000</w:t>
             </w:r>
           </w:p>
         </w:tc>
@@ -637,9 +668,9 @@
           </w:tcPr>
           <w:p>
             <w:r>
-              <w:t>Rp 325.000 / bulan ($20)</w:t>
+              <w:t>Rp 359.000 / bulan ($20)</w:t>
               <w:br/>
-              <w:t>Total: Rp 3.900.000</w:t>
+              <w:t>Total: Rp 359.000</w:t>
             </w:r>
           </w:p>
         </w:tc>
@@ -705,6 +736,8 @@
           <w:p>
             <w:r>
               <w:t>Kustom Domain (.id)</w:t>
+              <w:br/>
+              <w:t>Sample : Chronologie.store</w:t>
             </w:r>
           </w:p>
         </w:tc>
@@ -738,6 +771,8 @@
           <w:p>
             <w:r>
               <w:t>Rp 150.000 - Rp 250.000 / tahun</w:t>
+              <w:br/>
+              <w:t>562.000 / 3 tahun one time</w:t>
             </w:r>
           </w:p>
         </w:tc>
@@ -835,7 +870,7 @@
         <w:rPr>
           <w:b/>
         </w:rPr>
-        <w:t>Rp 4.050.000 - Rp 4.150.000</w:t>
+        <w:t>Rp 609.000 - Rp 609.000</w:t>
         <w:br/>
       </w:r>
       <w:r>
@@ -853,7 +888,7 @@
         <w:rPr>
           <w:b/>
         </w:rPr>
-        <w:t>60% - 80%</w:t>
+        <w:t>92% - 96%</w:t>
       </w:r>
       <w:r>
         <w:t>). Pada Hosting Lokal, biaya membengkak karena adanya kewajiban pengelolaan server (sysadmin) untuk menjamin agar server tidak down/mati saat diakses pelanggan, sedangkan Vercel menangani infrastruktur tersebut secara otomatis dan gratis.</w:t>
@@ -997,6 +1032,8 @@
                 <w:sz w:val="18"/>
               </w:rPr>
               <w:t>IT Business Partner</w:t>
+              <w:br/>
+              <w:t>PT Permata Landmarq Abadi</w:t>
             </w:r>
           </w:p>
         </w:tc>
@@ -1043,7 +1080,7 @@
                 <w:color w:val="442A07"/>
                 <w:sz w:val="21"/>
               </w:rPr>
-              <w:t>Erick Winata</w:t>
+              <w:t>Renaldi Martin Hutasoit</w:t>
               <w:br/>
             </w:r>
             <w:r>
@@ -1052,7 +1089,9 @@
                 <w:color w:val="2B2622"/>
                 <w:sz w:val="18"/>
               </w:rPr>
-              <w:t>Manager Chronologie</w:t>
+              <w:t>Direktur Utama</w:t>
+              <w:br/>
+              <w:t>PT Hourlogy Indah Perkasa</w:t>
             </w:r>
           </w:p>
         </w:tc>
@@ -1068,7 +1107,7 @@
           <w:color w:val="2B2622"/>
           <w:sz w:val="19"/>
         </w:rPr>
-        <w:t xml:space="preserve">Tanggal: ___________________          </w:t>
+        <w:t xml:space="preserve">Tanggal: 6 Juli 2026          </w:t>
       </w:r>
       <w:r>
         <w:rPr>

</xml_diff>